<commit_message>
feat: update name of system to J-PULSE
</commit_message>
<xml_diff>
--- a/HUONG_DAN_SU_DUNG_HE_THONG.docx
+++ b/HUONG_DAN_SU_DUNG_HE_THONG.docx
@@ -7,7 +7,7 @@
         <w:pStyle w:val="Tiu"/>
       </w:pPr>
       <w:r>
-        <w:t>Hướng dẫn sử dụng hệ thống WMS</w:t>
+        <w:t>Hướng dẫn sử dụng J-PULSE - Module Quản lý kho</w:t>
       </w:r>
     </w:p>
     <w:p>
@@ -72,7 +72,7 @@
               <w:rPr>
                 <w:sz w:val="20"/>
               </w:rPr>
-              <w:t>Joy World Cityfuns ERP System</w:t>
+              <w:t>J-PULSE (Joy World - Platform for Unified Leadership, Service &amp; Enterprise)</w:t>
             </w:r>
           </w:p>
         </w:tc>
@@ -13102,7 +13102,7 @@
         <w:color w:val="595959"/>
         <w:sz w:val="18"/>
       </w:rPr>
-      <w:t>Hướng dẫn sử dụng hệ thống WMS</w:t>
+      <w:t>Hướng dẫn sử dụng J-PULSE - Module Quản lý kho</w:t>
     </w:r>
   </w:p>
 </w:hdr>

</xml_diff>